<commit_message>
Added tables + ordered lists to blueprint theme
</commit_message>
<xml_diff>
--- a/input/section-test/section-test.docx
+++ b/input/section-test/section-test.docx
@@ -26,7 +26,87 @@
     </w:p>
     <w:p>
       <w:r>
-        <w:t>Nunc arcu odio, tincidunt vel mollis ut, hendrerit id odio. Duis laoreet, urna et consectetur porta, justo dui euismod dui, at fermentum dolor nibh in leo. Quisque volutpat semper odio vel suscipit. Aenean nec rutrum nisl, a bibendum felis. Aliquam vel tellus ultrices, luctus tortor eu, vehicula diam.</w:t>
+        <w:t xml:space="preserve">Nunc arcu odio, tincidunt vel mollis ut, hendrerit id odio. Duis laoreet, urna et consectetur porta, </w:t>
+      </w:r>
+      <w:r>
+        <w:rPr>
+          <w:b/>
+          <w:bCs/>
+        </w:rPr>
+        <w:t>justo dui euismod dui</w:t>
+      </w:r>
+      <w:r>
+        <w:t>, at fermentum dolor nibh in leo. Quisque volutpat semper odio vel suscipit. Aenean nec rutrum nisl, a bibendum felis. Aliquam vel tellus ultrices, luctus tortor eu, vehicula diam.</w:t>
+      </w:r>
+    </w:p>
+    <w:p>
+      <w:pPr>
+        <w:keepNext/>
+      </w:pPr>
+      <w:r>
+        <w:rPr>
+          <w:noProof/>
+        </w:rPr>
+        <w:drawing>
+          <wp:inline distT="0" distB="0" distL="0" distR="0" wp14:anchorId="67BAF932" wp14:editId="395CEE73">
+            <wp:extent cx="914400" cy="914400"/>
+            <wp:effectExtent l="0" t="0" r="0" b="0"/>
+            <wp:docPr id="1923679320" name="Graphic 1" descr="Baseball hat with solid fill"/>
+            <wp:cNvGraphicFramePr>
+              <a:graphicFrameLocks xmlns:a="http://schemas.openxmlformats.org/drawingml/2006/main" noChangeAspect="1"/>
+            </wp:cNvGraphicFramePr>
+            <a:graphic xmlns:a="http://schemas.openxmlformats.org/drawingml/2006/main">
+              <a:graphicData uri="http://schemas.openxmlformats.org/drawingml/2006/picture">
+                <pic:pic xmlns:pic="http://schemas.openxmlformats.org/drawingml/2006/picture">
+                  <pic:nvPicPr>
+                    <pic:cNvPr id="1923679320" name="Graphic 1923679320" descr="Baseball hat with solid fill"/>
+                    <pic:cNvPicPr/>
+                  </pic:nvPicPr>
+                  <pic:blipFill>
+                    <a:blip r:embed="rId5">
+                      <a:extLst>
+                        <a:ext uri="{96DAC541-7B7A-43D3-8B79-37D633B846F1}">
+                          <asvg:svgBlip xmlns:asvg="http://schemas.microsoft.com/office/drawing/2016/SVG/main" r:embed="rId6"/>
+                        </a:ext>
+                      </a:extLst>
+                    </a:blip>
+                    <a:stretch>
+                      <a:fillRect/>
+                    </a:stretch>
+                  </pic:blipFill>
+                  <pic:spPr>
+                    <a:xfrm>
+                      <a:off x="0" y="0"/>
+                      <a:ext cx="914400" cy="914400"/>
+                    </a:xfrm>
+                    <a:prstGeom prst="rect">
+                      <a:avLst/>
+                    </a:prstGeom>
+                  </pic:spPr>
+                </pic:pic>
+              </a:graphicData>
+            </a:graphic>
+          </wp:inline>
+        </w:drawing>
+      </w:r>
+    </w:p>
+    <w:p>
+      <w:pPr>
+        <w:pStyle w:val="Caption"/>
+      </w:pPr>
+      <w:r>
+        <w:t xml:space="preserve">Figure </w:t>
+      </w:r>
+      <w:fldSimple w:instr=" SEQ Figure \* ARABIC ">
+        <w:r>
+          <w:rPr>
+            <w:noProof/>
+          </w:rPr>
+          <w:t>1</w:t>
+        </w:r>
+      </w:fldSimple>
+      <w:r>
+        <w:t>A Hat</w:t>
       </w:r>
     </w:p>
     <w:p>
@@ -45,9 +125,282 @@
     </w:p>
     <w:p>
       <w:r>
-        <w:t>Fusce condimentum massa a massa porttitor, eleifend porta leo rhoncus. Fusce cursus ante ut elit mollis interdum. Fusce dignissim quam leo, non imperdiet leo efficitur quis. Duis condimentum eleifend hendrerit. Sed in diam eget ante luctus aliquam at vitae dui. Ut lacinia imperdiet elit, vitae vehicula erat suscipit vel.</w:t>
+        <w:t>Fusce condimentum massa a massa porttitor, eleifend porta leo rhoncus. Fusce cursus ante ut elit mollis interdum. Fusce dignissim quam leo, non imperdiet leo efficitur quis. Duis condimentum eleifend hendrerit.</w:t>
       </w:r>
     </w:p>
+    <w:p>
+      <w:pPr>
+        <w:pStyle w:val="ListParagraph"/>
+        <w:numPr>
+          <w:ilvl w:val="0"/>
+          <w:numId w:val="1"/>
+        </w:numPr>
+      </w:pPr>
+      <w:r>
+        <w:t>A first item</w:t>
+      </w:r>
+    </w:p>
+    <w:p>
+      <w:pPr>
+        <w:pStyle w:val="ListParagraph"/>
+        <w:numPr>
+          <w:ilvl w:val="0"/>
+          <w:numId w:val="1"/>
+        </w:numPr>
+      </w:pPr>
+      <w:r>
+        <w:t>Another one</w:t>
+      </w:r>
+    </w:p>
+    <w:p>
+      <w:pPr>
+        <w:pStyle w:val="ListParagraph"/>
+        <w:numPr>
+          <w:ilvl w:val="0"/>
+          <w:numId w:val="1"/>
+        </w:numPr>
+      </w:pPr>
+      <w:r>
+        <w:t>And another even longer one</w:t>
+      </w:r>
+    </w:p>
+    <w:p>
+      <w:r>
+        <w:t>Sed in diam eget ante luctus aliquam at vitae dui. Ut lacinia imperdiet elit, vitae vehicula erat suscipit vel.</w:t>
+      </w:r>
+    </w:p>
+    <w:tbl>
+      <w:tblPr>
+        <w:tblStyle w:val="PlainTable5"/>
+        <w:tblW w:w="0" w:type="auto"/>
+        <w:tblLook w:val="04A0" w:firstRow="1" w:lastRow="0" w:firstColumn="1" w:lastColumn="0" w:noHBand="0" w:noVBand="1"/>
+      </w:tblPr>
+      <w:tblGrid>
+        <w:gridCol w:w="2254"/>
+        <w:gridCol w:w="2254"/>
+        <w:gridCol w:w="2254"/>
+        <w:gridCol w:w="2254"/>
+      </w:tblGrid>
+      <w:tr>
+        <w:trPr>
+          <w:cnfStyle w:val="100000000000" w:firstRow="1" w:lastRow="0" w:firstColumn="0" w:lastColumn="0" w:oddVBand="0" w:evenVBand="0" w:oddHBand="0" w:evenHBand="0" w:firstRowFirstColumn="0" w:firstRowLastColumn="0" w:lastRowFirstColumn="0" w:lastRowLastColumn="0"/>
+        </w:trPr>
+        <w:tc>
+          <w:tcPr>
+            <w:cnfStyle w:val="001000000100" w:firstRow="0" w:lastRow="0" w:firstColumn="1" w:lastColumn="0" w:oddVBand="0" w:evenVBand="0" w:oddHBand="0" w:evenHBand="0" w:firstRowFirstColumn="1" w:firstRowLastColumn="0" w:lastRowFirstColumn="0" w:lastRowLastColumn="0"/>
+            <w:tcW w:w="2254" w:type="dxa"/>
+          </w:tcPr>
+          <w:p/>
+        </w:tc>
+        <w:tc>
+          <w:tcPr>
+            <w:tcW w:w="2254" w:type="dxa"/>
+          </w:tcPr>
+          <w:p>
+            <w:pPr>
+              <w:cnfStyle w:val="100000000000" w:firstRow="1" w:lastRow="0" w:firstColumn="0" w:lastColumn="0" w:oddVBand="0" w:evenVBand="0" w:oddHBand="0" w:evenHBand="0" w:firstRowFirstColumn="0" w:firstRowLastColumn="0" w:lastRowFirstColumn="0" w:lastRowLastColumn="0"/>
+            </w:pPr>
+            <w:r>
+              <w:t>Alpha</w:t>
+            </w:r>
+          </w:p>
+        </w:tc>
+        <w:tc>
+          <w:tcPr>
+            <w:tcW w:w="2254" w:type="dxa"/>
+          </w:tcPr>
+          <w:p>
+            <w:pPr>
+              <w:cnfStyle w:val="100000000000" w:firstRow="1" w:lastRow="0" w:firstColumn="0" w:lastColumn="0" w:oddVBand="0" w:evenVBand="0" w:oddHBand="0" w:evenHBand="0" w:firstRowFirstColumn="0" w:firstRowLastColumn="0" w:lastRowFirstColumn="0" w:lastRowLastColumn="0"/>
+            </w:pPr>
+            <w:r>
+              <w:t>Beta</w:t>
+            </w:r>
+          </w:p>
+        </w:tc>
+        <w:tc>
+          <w:tcPr>
+            <w:tcW w:w="2254" w:type="dxa"/>
+          </w:tcPr>
+          <w:p>
+            <w:pPr>
+              <w:cnfStyle w:val="100000000000" w:firstRow="1" w:lastRow="0" w:firstColumn="0" w:lastColumn="0" w:oddVBand="0" w:evenVBand="0" w:oddHBand="0" w:evenHBand="0" w:firstRowFirstColumn="0" w:firstRowLastColumn="0" w:lastRowFirstColumn="0" w:lastRowLastColumn="0"/>
+            </w:pPr>
+            <w:r>
+              <w:t>Gamma</w:t>
+            </w:r>
+          </w:p>
+        </w:tc>
+      </w:tr>
+      <w:tr>
+        <w:trPr>
+          <w:cnfStyle w:val="000000100000" w:firstRow="0" w:lastRow="0" w:firstColumn="0" w:lastColumn="0" w:oddVBand="0" w:evenVBand="0" w:oddHBand="1" w:evenHBand="0" w:firstRowFirstColumn="0" w:firstRowLastColumn="0" w:lastRowFirstColumn="0" w:lastRowLastColumn="0"/>
+        </w:trPr>
+        <w:tc>
+          <w:tcPr>
+            <w:cnfStyle w:val="001000000000" w:firstRow="0" w:lastRow="0" w:firstColumn="1" w:lastColumn="0" w:oddVBand="0" w:evenVBand="0" w:oddHBand="0" w:evenHBand="0" w:firstRowFirstColumn="0" w:firstRowLastColumn="0" w:lastRowFirstColumn="0" w:lastRowLastColumn="0"/>
+            <w:tcW w:w="2254" w:type="dxa"/>
+          </w:tcPr>
+          <w:p>
+            <w:r>
+              <w:t>One</w:t>
+            </w:r>
+          </w:p>
+        </w:tc>
+        <w:tc>
+          <w:tcPr>
+            <w:tcW w:w="2254" w:type="dxa"/>
+          </w:tcPr>
+          <w:p>
+            <w:pPr>
+              <w:cnfStyle w:val="000000100000" w:firstRow="0" w:lastRow="0" w:firstColumn="0" w:lastColumn="0" w:oddVBand="0" w:evenVBand="0" w:oddHBand="1" w:evenHBand="0" w:firstRowFirstColumn="0" w:firstRowLastColumn="0" w:lastRowFirstColumn="0" w:lastRowLastColumn="0"/>
+            </w:pPr>
+            <w:r>
+              <w:t>Abc</w:t>
+            </w:r>
+          </w:p>
+        </w:tc>
+        <w:tc>
+          <w:tcPr>
+            <w:tcW w:w="2254" w:type="dxa"/>
+          </w:tcPr>
+          <w:p>
+            <w:pPr>
+              <w:cnfStyle w:val="000000100000" w:firstRow="0" w:lastRow="0" w:firstColumn="0" w:lastColumn="0" w:oddVBand="0" w:evenVBand="0" w:oddHBand="1" w:evenHBand="0" w:firstRowFirstColumn="0" w:firstRowLastColumn="0" w:lastRowFirstColumn="0" w:lastRowLastColumn="0"/>
+            </w:pPr>
+            <w:r>
+              <w:t>Jkl</w:t>
+            </w:r>
+          </w:p>
+        </w:tc>
+        <w:tc>
+          <w:tcPr>
+            <w:tcW w:w="2254" w:type="dxa"/>
+          </w:tcPr>
+          <w:p>
+            <w:pPr>
+              <w:cnfStyle w:val="000000100000" w:firstRow="0" w:lastRow="0" w:firstColumn="0" w:lastColumn="0" w:oddVBand="0" w:evenVBand="0" w:oddHBand="1" w:evenHBand="0" w:firstRowFirstColumn="0" w:firstRowLastColumn="0" w:lastRowFirstColumn="0" w:lastRowLastColumn="0"/>
+            </w:pPr>
+            <w:r>
+              <w:t>Stu</w:t>
+            </w:r>
+          </w:p>
+        </w:tc>
+      </w:tr>
+      <w:tr>
+        <w:tc>
+          <w:tcPr>
+            <w:cnfStyle w:val="001000000000" w:firstRow="0" w:lastRow="0" w:firstColumn="1" w:lastColumn="0" w:oddVBand="0" w:evenVBand="0" w:oddHBand="0" w:evenHBand="0" w:firstRowFirstColumn="0" w:firstRowLastColumn="0" w:lastRowFirstColumn="0" w:lastRowLastColumn="0"/>
+            <w:tcW w:w="2254" w:type="dxa"/>
+          </w:tcPr>
+          <w:p>
+            <w:r>
+              <w:t>Two</w:t>
+            </w:r>
+          </w:p>
+        </w:tc>
+        <w:tc>
+          <w:tcPr>
+            <w:tcW w:w="2254" w:type="dxa"/>
+          </w:tcPr>
+          <w:p>
+            <w:pPr>
+              <w:cnfStyle w:val="000000000000" w:firstRow="0" w:lastRow="0" w:firstColumn="0" w:lastColumn="0" w:oddVBand="0" w:evenVBand="0" w:oddHBand="0" w:evenHBand="0" w:firstRowFirstColumn="0" w:firstRowLastColumn="0" w:lastRowFirstColumn="0" w:lastRowLastColumn="0"/>
+            </w:pPr>
+            <w:r>
+              <w:t>Def</w:t>
+            </w:r>
+          </w:p>
+        </w:tc>
+        <w:tc>
+          <w:tcPr>
+            <w:tcW w:w="2254" w:type="dxa"/>
+          </w:tcPr>
+          <w:p>
+            <w:pPr>
+              <w:cnfStyle w:val="000000000000" w:firstRow="0" w:lastRow="0" w:firstColumn="0" w:lastColumn="0" w:oddVBand="0" w:evenVBand="0" w:oddHBand="0" w:evenHBand="0" w:firstRowFirstColumn="0" w:firstRowLastColumn="0" w:lastRowFirstColumn="0" w:lastRowLastColumn="0"/>
+            </w:pPr>
+            <w:r>
+              <w:t>Mno</w:t>
+            </w:r>
+          </w:p>
+        </w:tc>
+        <w:tc>
+          <w:tcPr>
+            <w:tcW w:w="2254" w:type="dxa"/>
+          </w:tcPr>
+          <w:p>
+            <w:pPr>
+              <w:cnfStyle w:val="000000000000" w:firstRow="0" w:lastRow="0" w:firstColumn="0" w:lastColumn="0" w:oddVBand="0" w:evenVBand="0" w:oddHBand="0" w:evenHBand="0" w:firstRowFirstColumn="0" w:firstRowLastColumn="0" w:lastRowFirstColumn="0" w:lastRowLastColumn="0"/>
+            </w:pPr>
+            <w:r>
+              <w:t>Vwx</w:t>
+            </w:r>
+          </w:p>
+        </w:tc>
+      </w:tr>
+      <w:tr>
+        <w:trPr>
+          <w:cnfStyle w:val="000000100000" w:firstRow="0" w:lastRow="0" w:firstColumn="0" w:lastColumn="0" w:oddVBand="0" w:evenVBand="0" w:oddHBand="1" w:evenHBand="0" w:firstRowFirstColumn="0" w:firstRowLastColumn="0" w:lastRowFirstColumn="0" w:lastRowLastColumn="0"/>
+        </w:trPr>
+        <w:tc>
+          <w:tcPr>
+            <w:cnfStyle w:val="001000000000" w:firstRow="0" w:lastRow="0" w:firstColumn="1" w:lastColumn="0" w:oddVBand="0" w:evenVBand="0" w:oddHBand="0" w:evenHBand="0" w:firstRowFirstColumn="0" w:firstRowLastColumn="0" w:lastRowFirstColumn="0" w:lastRowLastColumn="0"/>
+            <w:tcW w:w="2254" w:type="dxa"/>
+          </w:tcPr>
+          <w:p>
+            <w:r>
+              <w:t>Three</w:t>
+            </w:r>
+          </w:p>
+        </w:tc>
+        <w:tc>
+          <w:tcPr>
+            <w:tcW w:w="2254" w:type="dxa"/>
+          </w:tcPr>
+          <w:p>
+            <w:pPr>
+              <w:cnfStyle w:val="000000100000" w:firstRow="0" w:lastRow="0" w:firstColumn="0" w:lastColumn="0" w:oddVBand="0" w:evenVBand="0" w:oddHBand="1" w:evenHBand="0" w:firstRowFirstColumn="0" w:firstRowLastColumn="0" w:lastRowFirstColumn="0" w:lastRowLastColumn="0"/>
+            </w:pPr>
+            <w:r>
+              <w:t>Ghi</w:t>
+            </w:r>
+          </w:p>
+        </w:tc>
+        <w:tc>
+          <w:tcPr>
+            <w:tcW w:w="2254" w:type="dxa"/>
+          </w:tcPr>
+          <w:p>
+            <w:pPr>
+              <w:cnfStyle w:val="000000100000" w:firstRow="0" w:lastRow="0" w:firstColumn="0" w:lastColumn="0" w:oddVBand="0" w:evenVBand="0" w:oddHBand="1" w:evenHBand="0" w:firstRowFirstColumn="0" w:firstRowLastColumn="0" w:lastRowFirstColumn="0" w:lastRowLastColumn="0"/>
+            </w:pPr>
+            <w:r>
+              <w:t>Pqr</w:t>
+            </w:r>
+          </w:p>
+        </w:tc>
+        <w:tc>
+          <w:tcPr>
+            <w:tcW w:w="2254" w:type="dxa"/>
+          </w:tcPr>
+          <w:p>
+            <w:pPr>
+              <w:cnfStyle w:val="000000100000" w:firstRow="0" w:lastRow="0" w:firstColumn="0" w:lastColumn="0" w:oddVBand="0" w:evenVBand="0" w:oddHBand="1" w:evenHBand="0" w:firstRowFirstColumn="0" w:firstRowLastColumn="0" w:lastRowFirstColumn="0" w:lastRowLastColumn="0"/>
+            </w:pPr>
+            <w:r>
+              <w:t>Yz</w:t>
+            </w:r>
+          </w:p>
+        </w:tc>
+      </w:tr>
+    </w:tbl>
+    <w:p>
+      <w:r>
+        <w:t>Abc</w:t>
+      </w:r>
+    </w:p>
+    <w:p/>
     <w:p>
       <w:pPr>
         <w:pStyle w:val="Heading2"/>
@@ -67,6 +420,7 @@
         <w:t>Donec in faucibus augue, vitae pellentesque elit. Sed quis ipsum consequat, placerat mi non, ultrices nisl. Vivamus vitae ultrices tortor, quis scelerisque arcu. Vestibulum vestibulum lacus in lacus rhoncus auctor.</w:t>
       </w:r>
     </w:p>
+    <w:p/>
     <w:p>
       <w:pPr>
         <w:pStyle w:val="heading-1-dark"/>
@@ -78,6 +432,7 @@
         <w:rPr>
           <w:shd w:val="clear" w:color="auto" w:fill="FFFFFF"/>
         </w:rPr>
+        <w:lastRenderedPageBreak/>
         <w:t>Sed rutrum consequat sapien</w:t>
       </w:r>
     </w:p>
@@ -96,6 +451,42 @@
     </w:p>
     <w:p>
       <w:pPr>
+        <w:pStyle w:val="ListParagraph"/>
+        <w:numPr>
+          <w:ilvl w:val="0"/>
+          <w:numId w:val="2"/>
+        </w:numPr>
+      </w:pPr>
+      <w:r>
+        <w:t>A first item</w:t>
+      </w:r>
+    </w:p>
+    <w:p>
+      <w:pPr>
+        <w:pStyle w:val="ListParagraph"/>
+        <w:numPr>
+          <w:ilvl w:val="0"/>
+          <w:numId w:val="2"/>
+        </w:numPr>
+      </w:pPr>
+      <w:r>
+        <w:t>Another one</w:t>
+      </w:r>
+    </w:p>
+    <w:p>
+      <w:pPr>
+        <w:pStyle w:val="ListParagraph"/>
+        <w:numPr>
+          <w:ilvl w:val="0"/>
+          <w:numId w:val="2"/>
+        </w:numPr>
+      </w:pPr>
+      <w:r>
+        <w:t>And another even longer one</w:t>
+      </w:r>
+    </w:p>
+    <w:p>
+      <w:pPr>
         <w:pStyle w:val="Heading2"/>
         <w:rPr>
           <w:shd w:val="clear" w:color="auto" w:fill="FFFFFF"/>
@@ -113,6 +504,238 @@
         <w:t>Donec in faucibus augue, vitae pellentesque elit. Sed quis ipsum consequat, placerat mi non, ultrices nisl. Vivamus vitae ultrices tortor, quis scelerisque arcu. Vestibulum vestibulum lacus in lacus rhoncus auctor.</w:t>
       </w:r>
     </w:p>
+    <w:p/>
+    <w:p>
+      <w:r>
+        <w:t>Some stuff.</w:t>
+      </w:r>
+    </w:p>
+    <w:tbl>
+      <w:tblPr>
+        <w:tblStyle w:val="PlainTable5"/>
+        <w:tblW w:w="0" w:type="auto"/>
+        <w:tblLook w:val="04A0" w:firstRow="1" w:lastRow="0" w:firstColumn="1" w:lastColumn="0" w:noHBand="0" w:noVBand="1"/>
+      </w:tblPr>
+      <w:tblGrid>
+        <w:gridCol w:w="2254"/>
+        <w:gridCol w:w="2254"/>
+        <w:gridCol w:w="2254"/>
+        <w:gridCol w:w="2254"/>
+      </w:tblGrid>
+      <w:tr>
+        <w:trPr>
+          <w:cnfStyle w:val="100000000000" w:firstRow="1" w:lastRow="0" w:firstColumn="0" w:lastColumn="0" w:oddVBand="0" w:evenVBand="0" w:oddHBand="0" w:evenHBand="0" w:firstRowFirstColumn="0" w:firstRowLastColumn="0" w:lastRowFirstColumn="0" w:lastRowLastColumn="0"/>
+        </w:trPr>
+        <w:tc>
+          <w:tcPr>
+            <w:cnfStyle w:val="001000000100" w:firstRow="0" w:lastRow="0" w:firstColumn="1" w:lastColumn="0" w:oddVBand="0" w:evenVBand="0" w:oddHBand="0" w:evenHBand="0" w:firstRowFirstColumn="1" w:firstRowLastColumn="0" w:lastRowFirstColumn="0" w:lastRowLastColumn="0"/>
+            <w:tcW w:w="2254" w:type="dxa"/>
+          </w:tcPr>
+          <w:p/>
+        </w:tc>
+        <w:tc>
+          <w:tcPr>
+            <w:tcW w:w="2254" w:type="dxa"/>
+          </w:tcPr>
+          <w:p>
+            <w:pPr>
+              <w:cnfStyle w:val="100000000000" w:firstRow="1" w:lastRow="0" w:firstColumn="0" w:lastColumn="0" w:oddVBand="0" w:evenVBand="0" w:oddHBand="0" w:evenHBand="0" w:firstRowFirstColumn="0" w:firstRowLastColumn="0" w:lastRowFirstColumn="0" w:lastRowLastColumn="0"/>
+            </w:pPr>
+            <w:r>
+              <w:t>Alpha</w:t>
+            </w:r>
+          </w:p>
+        </w:tc>
+        <w:tc>
+          <w:tcPr>
+            <w:tcW w:w="2254" w:type="dxa"/>
+          </w:tcPr>
+          <w:p>
+            <w:pPr>
+              <w:cnfStyle w:val="100000000000" w:firstRow="1" w:lastRow="0" w:firstColumn="0" w:lastColumn="0" w:oddVBand="0" w:evenVBand="0" w:oddHBand="0" w:evenHBand="0" w:firstRowFirstColumn="0" w:firstRowLastColumn="0" w:lastRowFirstColumn="0" w:lastRowLastColumn="0"/>
+            </w:pPr>
+            <w:r>
+              <w:t>Beta</w:t>
+            </w:r>
+          </w:p>
+        </w:tc>
+        <w:tc>
+          <w:tcPr>
+            <w:tcW w:w="2254" w:type="dxa"/>
+          </w:tcPr>
+          <w:p>
+            <w:pPr>
+              <w:cnfStyle w:val="100000000000" w:firstRow="1" w:lastRow="0" w:firstColumn="0" w:lastColumn="0" w:oddVBand="0" w:evenVBand="0" w:oddHBand="0" w:evenHBand="0" w:firstRowFirstColumn="0" w:firstRowLastColumn="0" w:lastRowFirstColumn="0" w:lastRowLastColumn="0"/>
+            </w:pPr>
+            <w:r>
+              <w:t>Gamma</w:t>
+            </w:r>
+          </w:p>
+        </w:tc>
+      </w:tr>
+      <w:tr>
+        <w:trPr>
+          <w:cnfStyle w:val="000000100000" w:firstRow="0" w:lastRow="0" w:firstColumn="0" w:lastColumn="0" w:oddVBand="0" w:evenVBand="0" w:oddHBand="1" w:evenHBand="0" w:firstRowFirstColumn="0" w:firstRowLastColumn="0" w:lastRowFirstColumn="0" w:lastRowLastColumn="0"/>
+        </w:trPr>
+        <w:tc>
+          <w:tcPr>
+            <w:cnfStyle w:val="001000000000" w:firstRow="0" w:lastRow="0" w:firstColumn="1" w:lastColumn="0" w:oddVBand="0" w:evenVBand="0" w:oddHBand="0" w:evenHBand="0" w:firstRowFirstColumn="0" w:firstRowLastColumn="0" w:lastRowFirstColumn="0" w:lastRowLastColumn="0"/>
+            <w:tcW w:w="2254" w:type="dxa"/>
+          </w:tcPr>
+          <w:p>
+            <w:r>
+              <w:t>One</w:t>
+            </w:r>
+          </w:p>
+        </w:tc>
+        <w:tc>
+          <w:tcPr>
+            <w:tcW w:w="2254" w:type="dxa"/>
+          </w:tcPr>
+          <w:p>
+            <w:pPr>
+              <w:cnfStyle w:val="000000100000" w:firstRow="0" w:lastRow="0" w:firstColumn="0" w:lastColumn="0" w:oddVBand="0" w:evenVBand="0" w:oddHBand="1" w:evenHBand="0" w:firstRowFirstColumn="0" w:firstRowLastColumn="0" w:lastRowFirstColumn="0" w:lastRowLastColumn="0"/>
+            </w:pPr>
+            <w:r>
+              <w:t>Abc</w:t>
+            </w:r>
+          </w:p>
+        </w:tc>
+        <w:tc>
+          <w:tcPr>
+            <w:tcW w:w="2254" w:type="dxa"/>
+          </w:tcPr>
+          <w:p>
+            <w:pPr>
+              <w:cnfStyle w:val="000000100000" w:firstRow="0" w:lastRow="0" w:firstColumn="0" w:lastColumn="0" w:oddVBand="0" w:evenVBand="0" w:oddHBand="1" w:evenHBand="0" w:firstRowFirstColumn="0" w:firstRowLastColumn="0" w:lastRowFirstColumn="0" w:lastRowLastColumn="0"/>
+            </w:pPr>
+            <w:r>
+              <w:t>Jkl</w:t>
+            </w:r>
+          </w:p>
+        </w:tc>
+        <w:tc>
+          <w:tcPr>
+            <w:tcW w:w="2254" w:type="dxa"/>
+          </w:tcPr>
+          <w:p>
+            <w:pPr>
+              <w:cnfStyle w:val="000000100000" w:firstRow="0" w:lastRow="0" w:firstColumn="0" w:lastColumn="0" w:oddVBand="0" w:evenVBand="0" w:oddHBand="1" w:evenHBand="0" w:firstRowFirstColumn="0" w:firstRowLastColumn="0" w:lastRowFirstColumn="0" w:lastRowLastColumn="0"/>
+            </w:pPr>
+            <w:r>
+              <w:t>Stu</w:t>
+            </w:r>
+          </w:p>
+        </w:tc>
+      </w:tr>
+      <w:tr>
+        <w:tc>
+          <w:tcPr>
+            <w:cnfStyle w:val="001000000000" w:firstRow="0" w:lastRow="0" w:firstColumn="1" w:lastColumn="0" w:oddVBand="0" w:evenVBand="0" w:oddHBand="0" w:evenHBand="0" w:firstRowFirstColumn="0" w:firstRowLastColumn="0" w:lastRowFirstColumn="0" w:lastRowLastColumn="0"/>
+            <w:tcW w:w="2254" w:type="dxa"/>
+          </w:tcPr>
+          <w:p>
+            <w:r>
+              <w:t>Two</w:t>
+            </w:r>
+          </w:p>
+        </w:tc>
+        <w:tc>
+          <w:tcPr>
+            <w:tcW w:w="2254" w:type="dxa"/>
+          </w:tcPr>
+          <w:p>
+            <w:pPr>
+              <w:cnfStyle w:val="000000000000" w:firstRow="0" w:lastRow="0" w:firstColumn="0" w:lastColumn="0" w:oddVBand="0" w:evenVBand="0" w:oddHBand="0" w:evenHBand="0" w:firstRowFirstColumn="0" w:firstRowLastColumn="0" w:lastRowFirstColumn="0" w:lastRowLastColumn="0"/>
+            </w:pPr>
+            <w:r>
+              <w:t>Def</w:t>
+            </w:r>
+          </w:p>
+        </w:tc>
+        <w:tc>
+          <w:tcPr>
+            <w:tcW w:w="2254" w:type="dxa"/>
+          </w:tcPr>
+          <w:p>
+            <w:pPr>
+              <w:cnfStyle w:val="000000000000" w:firstRow="0" w:lastRow="0" w:firstColumn="0" w:lastColumn="0" w:oddVBand="0" w:evenVBand="0" w:oddHBand="0" w:evenHBand="0" w:firstRowFirstColumn="0" w:firstRowLastColumn="0" w:lastRowFirstColumn="0" w:lastRowLastColumn="0"/>
+            </w:pPr>
+            <w:r>
+              <w:t>Mno</w:t>
+            </w:r>
+          </w:p>
+        </w:tc>
+        <w:tc>
+          <w:tcPr>
+            <w:tcW w:w="2254" w:type="dxa"/>
+          </w:tcPr>
+          <w:p>
+            <w:pPr>
+              <w:cnfStyle w:val="000000000000" w:firstRow="0" w:lastRow="0" w:firstColumn="0" w:lastColumn="0" w:oddVBand="0" w:evenVBand="0" w:oddHBand="0" w:evenHBand="0" w:firstRowFirstColumn="0" w:firstRowLastColumn="0" w:lastRowFirstColumn="0" w:lastRowLastColumn="0"/>
+            </w:pPr>
+            <w:r>
+              <w:t>Vwx</w:t>
+            </w:r>
+          </w:p>
+        </w:tc>
+      </w:tr>
+      <w:tr>
+        <w:trPr>
+          <w:cnfStyle w:val="000000100000" w:firstRow="0" w:lastRow="0" w:firstColumn="0" w:lastColumn="0" w:oddVBand="0" w:evenVBand="0" w:oddHBand="1" w:evenHBand="0" w:firstRowFirstColumn="0" w:firstRowLastColumn="0" w:lastRowFirstColumn="0" w:lastRowLastColumn="0"/>
+        </w:trPr>
+        <w:tc>
+          <w:tcPr>
+            <w:cnfStyle w:val="001000000000" w:firstRow="0" w:lastRow="0" w:firstColumn="1" w:lastColumn="0" w:oddVBand="0" w:evenVBand="0" w:oddHBand="0" w:evenHBand="0" w:firstRowFirstColumn="0" w:firstRowLastColumn="0" w:lastRowFirstColumn="0" w:lastRowLastColumn="0"/>
+            <w:tcW w:w="2254" w:type="dxa"/>
+          </w:tcPr>
+          <w:p>
+            <w:r>
+              <w:t>Three</w:t>
+            </w:r>
+          </w:p>
+        </w:tc>
+        <w:tc>
+          <w:tcPr>
+            <w:tcW w:w="2254" w:type="dxa"/>
+          </w:tcPr>
+          <w:p>
+            <w:pPr>
+              <w:cnfStyle w:val="000000100000" w:firstRow="0" w:lastRow="0" w:firstColumn="0" w:lastColumn="0" w:oddVBand="0" w:evenVBand="0" w:oddHBand="1" w:evenHBand="0" w:firstRowFirstColumn="0" w:firstRowLastColumn="0" w:lastRowFirstColumn="0" w:lastRowLastColumn="0"/>
+            </w:pPr>
+            <w:r>
+              <w:t>Ghi</w:t>
+            </w:r>
+          </w:p>
+        </w:tc>
+        <w:tc>
+          <w:tcPr>
+            <w:tcW w:w="2254" w:type="dxa"/>
+          </w:tcPr>
+          <w:p>
+            <w:pPr>
+              <w:cnfStyle w:val="000000100000" w:firstRow="0" w:lastRow="0" w:firstColumn="0" w:lastColumn="0" w:oddVBand="0" w:evenVBand="0" w:oddHBand="1" w:evenHBand="0" w:firstRowFirstColumn="0" w:firstRowLastColumn="0" w:lastRowFirstColumn="0" w:lastRowLastColumn="0"/>
+            </w:pPr>
+            <w:r>
+              <w:t>Pqr</w:t>
+            </w:r>
+          </w:p>
+        </w:tc>
+        <w:tc>
+          <w:tcPr>
+            <w:tcW w:w="2254" w:type="dxa"/>
+          </w:tcPr>
+          <w:p>
+            <w:pPr>
+              <w:cnfStyle w:val="000000100000" w:firstRow="0" w:lastRow="0" w:firstColumn="0" w:lastColumn="0" w:oddVBand="0" w:evenVBand="0" w:oddHBand="1" w:evenHBand="0" w:firstRowFirstColumn="0" w:firstRowLastColumn="0" w:lastRowFirstColumn="0" w:lastRowLastColumn="0"/>
+            </w:pPr>
+            <w:r>
+              <w:t>Yz</w:t>
+            </w:r>
+          </w:p>
+        </w:tc>
+      </w:tr>
+    </w:tbl>
     <w:p/>
     <w:sectPr>
       <w:pgSz w:w="11906" w:h="16838"/>
@@ -122,6 +745,195 @@
     </w:sectPr>
   </w:body>
 </w:document>
+</file>
+
+<file path=word/numbering.xml><?xml version="1.0" encoding="utf-8"?>
+<w:numbering xmlns:wpc="http://schemas.microsoft.com/office/word/2010/wordprocessingCanvas" xmlns:cx="http://schemas.microsoft.com/office/drawing/2014/chartex" xmlns:cx1="http://schemas.microsoft.com/office/drawing/2015/9/8/chartex" xmlns:cx2="http://schemas.microsoft.com/office/drawing/2015/10/21/chartex" xmlns:cx3="http://schemas.microsoft.com/office/drawing/2016/5/9/chartex" xmlns:cx4="http://schemas.microsoft.com/office/drawing/2016/5/10/chartex" xmlns:cx5="http://schemas.microsoft.com/office/drawing/2016/5/11/chartex" xmlns:cx6="http://schemas.microsoft.com/office/drawing/2016/5/12/chartex" xmlns:cx7="http://schemas.microsoft.com/office/drawing/2016/5/13/chartex" xmlns:cx8="http://schemas.microsoft.com/office/drawing/2016/5/14/chartex" xmlns:mc="http://schemas.openxmlformats.org/markup-compatibility/2006" xmlns:aink="http://schemas.microsoft.com/office/drawing/2016/ink" xmlns:am3d="http://schemas.microsoft.com/office/drawing/2017/model3d" xmlns:o="urn:schemas-microsoft-com:office:office" xmlns:oel="http://schemas.microsoft.com/office/2019/extlst" xmlns:r="http://schemas.openxmlformats.org/officeDocument/2006/relationships" xmlns:m="http://schemas.openxmlformats.org/officeDocument/2006/math" xmlns:v="urn:schemas-microsoft-com:vml" xmlns:wp14="http://schemas.microsoft.com/office/word/2010/wordprocessingDrawing" xmlns:wp="http://schemas.openxmlformats.org/drawingml/2006/wordprocessingDrawing" xmlns:w10="urn:schemas-microsoft-com:office:word" xmlns:w="http://schemas.openxmlformats.org/wordprocessingml/2006/main" xmlns:w14="http://schemas.microsoft.com/office/word/2010/wordml" xmlns:w15="http://schemas.microsoft.com/office/word/2012/wordml" xmlns:w16cex="http://schemas.microsoft.com/office/word/2018/wordml/cex" xmlns:w16cid="http://schemas.microsoft.com/office/word/2016/wordml/cid" xmlns:w16="http://schemas.microsoft.com/office/word/2018/wordml" xmlns:w16du="http://schemas.microsoft.com/office/word/2023/wordml/word16du" xmlns:w16sdtdh="http://schemas.microsoft.com/office/word/2020/wordml/sdtdatahash" xmlns:w16sdtfl="http://schemas.microsoft.com/office/word/2024/wordml/sdtformatlock" xmlns:w16se="http://schemas.microsoft.com/office/word/2015/wordml/symex" xmlns:wpg="http://schemas.microsoft.com/office/word/2010/wordprocessingGroup" xmlns:wpi="http://schemas.microsoft.com/office/word/2010/wordprocessingInk" xmlns:wne="http://schemas.microsoft.com/office/word/2006/wordml" xmlns:wps="http://schemas.microsoft.com/office/word/2010/wordprocessingShape" mc:Ignorable="w14 w15 w16se w16cid w16 w16cex w16sdtdh w16sdtfl w16du wp14">
+  <w:abstractNum w:abstractNumId="0" w15:restartNumberingAfterBreak="0">
+    <w:nsid w:val="06587B62"/>
+    <w:multiLevelType w:val="hybridMultilevel"/>
+    <w:tmpl w:val="3FF02708"/>
+    <w:lvl w:ilvl="0" w:tplc="0809000F">
+      <w:start w:val="1"/>
+      <w:numFmt w:val="decimal"/>
+      <w:lvlText w:val="%1."/>
+      <w:lvlJc w:val="left"/>
+      <w:pPr>
+        <w:ind w:left="720" w:hanging="360"/>
+      </w:pPr>
+      <w:rPr>
+        <w:rFonts w:hint="default"/>
+      </w:rPr>
+    </w:lvl>
+    <w:lvl w:ilvl="1" w:tplc="08090019" w:tentative="1">
+      <w:start w:val="1"/>
+      <w:numFmt w:val="lowerLetter"/>
+      <w:lvlText w:val="%2."/>
+      <w:lvlJc w:val="left"/>
+      <w:pPr>
+        <w:ind w:left="1440" w:hanging="360"/>
+      </w:pPr>
+    </w:lvl>
+    <w:lvl w:ilvl="2" w:tplc="0809001B" w:tentative="1">
+      <w:start w:val="1"/>
+      <w:numFmt w:val="lowerRoman"/>
+      <w:lvlText w:val="%3."/>
+      <w:lvlJc w:val="right"/>
+      <w:pPr>
+        <w:ind w:left="2160" w:hanging="180"/>
+      </w:pPr>
+    </w:lvl>
+    <w:lvl w:ilvl="3" w:tplc="0809000F" w:tentative="1">
+      <w:start w:val="1"/>
+      <w:numFmt w:val="decimal"/>
+      <w:lvlText w:val="%4."/>
+      <w:lvlJc w:val="left"/>
+      <w:pPr>
+        <w:ind w:left="2880" w:hanging="360"/>
+      </w:pPr>
+    </w:lvl>
+    <w:lvl w:ilvl="4" w:tplc="08090019" w:tentative="1">
+      <w:start w:val="1"/>
+      <w:numFmt w:val="lowerLetter"/>
+      <w:lvlText w:val="%5."/>
+      <w:lvlJc w:val="left"/>
+      <w:pPr>
+        <w:ind w:left="3600" w:hanging="360"/>
+      </w:pPr>
+    </w:lvl>
+    <w:lvl w:ilvl="5" w:tplc="0809001B" w:tentative="1">
+      <w:start w:val="1"/>
+      <w:numFmt w:val="lowerRoman"/>
+      <w:lvlText w:val="%6."/>
+      <w:lvlJc w:val="right"/>
+      <w:pPr>
+        <w:ind w:left="4320" w:hanging="180"/>
+      </w:pPr>
+    </w:lvl>
+    <w:lvl w:ilvl="6" w:tplc="0809000F" w:tentative="1">
+      <w:start w:val="1"/>
+      <w:numFmt w:val="decimal"/>
+      <w:lvlText w:val="%7."/>
+      <w:lvlJc w:val="left"/>
+      <w:pPr>
+        <w:ind w:left="5040" w:hanging="360"/>
+      </w:pPr>
+    </w:lvl>
+    <w:lvl w:ilvl="7" w:tplc="08090019" w:tentative="1">
+      <w:start w:val="1"/>
+      <w:numFmt w:val="lowerLetter"/>
+      <w:lvlText w:val="%8."/>
+      <w:lvlJc w:val="left"/>
+      <w:pPr>
+        <w:ind w:left="5760" w:hanging="360"/>
+      </w:pPr>
+    </w:lvl>
+    <w:lvl w:ilvl="8" w:tplc="0809001B" w:tentative="1">
+      <w:start w:val="1"/>
+      <w:numFmt w:val="lowerRoman"/>
+      <w:lvlText w:val="%9."/>
+      <w:lvlJc w:val="right"/>
+      <w:pPr>
+        <w:ind w:left="6480" w:hanging="180"/>
+      </w:pPr>
+    </w:lvl>
+  </w:abstractNum>
+  <w:abstractNum w:abstractNumId="1" w15:restartNumberingAfterBreak="0">
+    <w:nsid w:val="23B228EF"/>
+    <w:multiLevelType w:val="hybridMultilevel"/>
+    <w:tmpl w:val="3FF02708"/>
+    <w:lvl w:ilvl="0" w:tplc="FFFFFFFF">
+      <w:start w:val="1"/>
+      <w:numFmt w:val="decimal"/>
+      <w:lvlText w:val="%1."/>
+      <w:lvlJc w:val="left"/>
+      <w:pPr>
+        <w:ind w:left="720" w:hanging="360"/>
+      </w:pPr>
+      <w:rPr>
+        <w:rFonts w:hint="default"/>
+      </w:rPr>
+    </w:lvl>
+    <w:lvl w:ilvl="1" w:tplc="FFFFFFFF" w:tentative="1">
+      <w:start w:val="1"/>
+      <w:numFmt w:val="lowerLetter"/>
+      <w:lvlText w:val="%2."/>
+      <w:lvlJc w:val="left"/>
+      <w:pPr>
+        <w:ind w:left="1440" w:hanging="360"/>
+      </w:pPr>
+    </w:lvl>
+    <w:lvl w:ilvl="2" w:tplc="FFFFFFFF" w:tentative="1">
+      <w:start w:val="1"/>
+      <w:numFmt w:val="lowerRoman"/>
+      <w:lvlText w:val="%3."/>
+      <w:lvlJc w:val="right"/>
+      <w:pPr>
+        <w:ind w:left="2160" w:hanging="180"/>
+      </w:pPr>
+    </w:lvl>
+    <w:lvl w:ilvl="3" w:tplc="FFFFFFFF" w:tentative="1">
+      <w:start w:val="1"/>
+      <w:numFmt w:val="decimal"/>
+      <w:lvlText w:val="%4."/>
+      <w:lvlJc w:val="left"/>
+      <w:pPr>
+        <w:ind w:left="2880" w:hanging="360"/>
+      </w:pPr>
+    </w:lvl>
+    <w:lvl w:ilvl="4" w:tplc="FFFFFFFF" w:tentative="1">
+      <w:start w:val="1"/>
+      <w:numFmt w:val="lowerLetter"/>
+      <w:lvlText w:val="%5."/>
+      <w:lvlJc w:val="left"/>
+      <w:pPr>
+        <w:ind w:left="3600" w:hanging="360"/>
+      </w:pPr>
+    </w:lvl>
+    <w:lvl w:ilvl="5" w:tplc="FFFFFFFF" w:tentative="1">
+      <w:start w:val="1"/>
+      <w:numFmt w:val="lowerRoman"/>
+      <w:lvlText w:val="%6."/>
+      <w:lvlJc w:val="right"/>
+      <w:pPr>
+        <w:ind w:left="4320" w:hanging="180"/>
+      </w:pPr>
+    </w:lvl>
+    <w:lvl w:ilvl="6" w:tplc="FFFFFFFF" w:tentative="1">
+      <w:start w:val="1"/>
+      <w:numFmt w:val="decimal"/>
+      <w:lvlText w:val="%7."/>
+      <w:lvlJc w:val="left"/>
+      <w:pPr>
+        <w:ind w:left="5040" w:hanging="360"/>
+      </w:pPr>
+    </w:lvl>
+    <w:lvl w:ilvl="7" w:tplc="FFFFFFFF" w:tentative="1">
+      <w:start w:val="1"/>
+      <w:numFmt w:val="lowerLetter"/>
+      <w:lvlText w:val="%8."/>
+      <w:lvlJc w:val="left"/>
+      <w:pPr>
+        <w:ind w:left="5760" w:hanging="360"/>
+      </w:pPr>
+    </w:lvl>
+    <w:lvl w:ilvl="8" w:tplc="FFFFFFFF" w:tentative="1">
+      <w:start w:val="1"/>
+      <w:numFmt w:val="lowerRoman"/>
+      <w:lvlText w:val="%9."/>
+      <w:lvlJc w:val="right"/>
+      <w:pPr>
+        <w:ind w:left="6480" w:hanging="180"/>
+      </w:pPr>
+    </w:lvl>
+  </w:abstractNum>
+  <w:num w:numId="1" w16cid:durableId="489449222">
+    <w:abstractNumId w:val="0"/>
+  </w:num>
+  <w:num w:numId="2" w16cid:durableId="115684629">
+    <w:abstractNumId w:val="1"/>
+  </w:num>
+</w:numbering>
 </file>
 
 <file path=word/styles.xml><?xml version="1.0" encoding="utf-8"?>
@@ -1045,6 +1857,164 @@
     <w:qFormat/>
     <w:rsid w:val="00875693"/>
   </w:style>
+  <w:style w:type="table" w:styleId="TableGrid">
+    <w:name w:val="Table Grid"/>
+    <w:basedOn w:val="TableNormal"/>
+    <w:uiPriority w:val="39"/>
+    <w:rsid w:val="00923C28"/>
+    <w:pPr>
+      <w:spacing w:after="0" w:line="240" w:lineRule="auto"/>
+    </w:pPr>
+    <w:tblPr>
+      <w:tblBorders>
+        <w:top w:val="single" w:sz="4" w:space="0" w:color="auto"/>
+        <w:left w:val="single" w:sz="4" w:space="0" w:color="auto"/>
+        <w:bottom w:val="single" w:sz="4" w:space="0" w:color="auto"/>
+        <w:right w:val="single" w:sz="4" w:space="0" w:color="auto"/>
+        <w:insideH w:val="single" w:sz="4" w:space="0" w:color="auto"/>
+        <w:insideV w:val="single" w:sz="4" w:space="0" w:color="auto"/>
+      </w:tblBorders>
+    </w:tblPr>
+  </w:style>
+  <w:style w:type="table" w:styleId="PlainTable5">
+    <w:name w:val="Plain Table 5"/>
+    <w:basedOn w:val="TableNormal"/>
+    <w:uiPriority w:val="45"/>
+    <w:rsid w:val="00923C28"/>
+    <w:pPr>
+      <w:spacing w:after="0" w:line="240" w:lineRule="auto"/>
+    </w:pPr>
+    <w:tblPr>
+      <w:tblStyleRowBandSize w:val="1"/>
+      <w:tblStyleColBandSize w:val="1"/>
+    </w:tblPr>
+    <w:tblStylePr w:type="firstRow">
+      <w:rPr>
+        <w:rFonts w:asciiTheme="majorHAnsi" w:eastAsiaTheme="majorEastAsia" w:hAnsiTheme="majorHAnsi" w:cstheme="majorBidi"/>
+        <w:i/>
+        <w:iCs/>
+        <w:sz w:val="26"/>
+      </w:rPr>
+      <w:tblPr/>
+      <w:tcPr>
+        <w:tcBorders>
+          <w:bottom w:val="single" w:sz="4" w:space="0" w:color="7F7F7F" w:themeColor="text1" w:themeTint="80"/>
+        </w:tcBorders>
+        <w:shd w:val="clear" w:color="auto" w:fill="FFFFFF" w:themeFill="background1"/>
+      </w:tcPr>
+    </w:tblStylePr>
+    <w:tblStylePr w:type="lastRow">
+      <w:rPr>
+        <w:rFonts w:asciiTheme="majorHAnsi" w:eastAsiaTheme="majorEastAsia" w:hAnsiTheme="majorHAnsi" w:cstheme="majorBidi"/>
+        <w:i/>
+        <w:iCs/>
+        <w:sz w:val="26"/>
+      </w:rPr>
+      <w:tblPr/>
+      <w:tcPr>
+        <w:tcBorders>
+          <w:top w:val="single" w:sz="4" w:space="0" w:color="7F7F7F" w:themeColor="text1" w:themeTint="80"/>
+        </w:tcBorders>
+        <w:shd w:val="clear" w:color="auto" w:fill="FFFFFF" w:themeFill="background1"/>
+      </w:tcPr>
+    </w:tblStylePr>
+    <w:tblStylePr w:type="firstCol">
+      <w:pPr>
+        <w:jc w:val="right"/>
+      </w:pPr>
+      <w:rPr>
+        <w:rFonts w:asciiTheme="majorHAnsi" w:eastAsiaTheme="majorEastAsia" w:hAnsiTheme="majorHAnsi" w:cstheme="majorBidi"/>
+        <w:i/>
+        <w:iCs/>
+        <w:sz w:val="26"/>
+      </w:rPr>
+      <w:tblPr/>
+      <w:tcPr>
+        <w:tcBorders>
+          <w:right w:val="single" w:sz="4" w:space="0" w:color="7F7F7F" w:themeColor="text1" w:themeTint="80"/>
+        </w:tcBorders>
+        <w:shd w:val="clear" w:color="auto" w:fill="FFFFFF" w:themeFill="background1"/>
+      </w:tcPr>
+    </w:tblStylePr>
+    <w:tblStylePr w:type="lastCol">
+      <w:rPr>
+        <w:rFonts w:asciiTheme="majorHAnsi" w:eastAsiaTheme="majorEastAsia" w:hAnsiTheme="majorHAnsi" w:cstheme="majorBidi"/>
+        <w:i/>
+        <w:iCs/>
+        <w:sz w:val="26"/>
+      </w:rPr>
+      <w:tblPr/>
+      <w:tcPr>
+        <w:tcBorders>
+          <w:left w:val="single" w:sz="4" w:space="0" w:color="7F7F7F" w:themeColor="text1" w:themeTint="80"/>
+        </w:tcBorders>
+        <w:shd w:val="clear" w:color="auto" w:fill="FFFFFF" w:themeFill="background1"/>
+      </w:tcPr>
+    </w:tblStylePr>
+    <w:tblStylePr w:type="band1Vert">
+      <w:tblPr/>
+      <w:tcPr>
+        <w:shd w:val="clear" w:color="auto" w:fill="F2F2F2" w:themeFill="background1" w:themeFillShade="F2"/>
+      </w:tcPr>
+    </w:tblStylePr>
+    <w:tblStylePr w:type="band1Horz">
+      <w:tblPr/>
+      <w:tcPr>
+        <w:shd w:val="clear" w:color="auto" w:fill="F2F2F2" w:themeFill="background1" w:themeFillShade="F2"/>
+      </w:tcPr>
+    </w:tblStylePr>
+    <w:tblStylePr w:type="neCell">
+      <w:tblPr/>
+      <w:tcPr>
+        <w:tcBorders>
+          <w:left w:val="nil"/>
+        </w:tcBorders>
+      </w:tcPr>
+    </w:tblStylePr>
+    <w:tblStylePr w:type="nwCell">
+      <w:tblPr/>
+      <w:tcPr>
+        <w:tcBorders>
+          <w:right w:val="nil"/>
+        </w:tcBorders>
+      </w:tcPr>
+    </w:tblStylePr>
+    <w:tblStylePr w:type="seCell">
+      <w:tblPr/>
+      <w:tcPr>
+        <w:tcBorders>
+          <w:left w:val="nil"/>
+        </w:tcBorders>
+      </w:tcPr>
+    </w:tblStylePr>
+    <w:tblStylePr w:type="swCell">
+      <w:tblPr/>
+      <w:tcPr>
+        <w:tcBorders>
+          <w:right w:val="nil"/>
+        </w:tcBorders>
+      </w:tcPr>
+    </w:tblStylePr>
+  </w:style>
+  <w:style w:type="paragraph" w:styleId="Caption">
+    <w:name w:val="caption"/>
+    <w:basedOn w:val="Normal"/>
+    <w:next w:val="Normal"/>
+    <w:uiPriority w:val="35"/>
+    <w:unhideWhenUsed/>
+    <w:qFormat/>
+    <w:rsid w:val="000A6752"/>
+    <w:pPr>
+      <w:spacing w:after="200" w:line="240" w:lineRule="auto"/>
+    </w:pPr>
+    <w:rPr>
+      <w:i/>
+      <w:iCs/>
+      <w:color w:val="0E2841" w:themeColor="text2"/>
+      <w:sz w:val="18"/>
+      <w:szCs w:val="18"/>
+    </w:rPr>
+  </w:style>
 </w:styles>
 </file>
 

</xml_diff>

<commit_message>
Backup prior to using ChatGPT to neaten some code... wish me luck
</commit_message>
<xml_diff>
--- a/input/section-test/section-test.docx
+++ b/input/section-test/section-test.docx
@@ -13,7 +13,21 @@
         <w:rPr>
           <w:shd w:val="clear" w:color="auto" w:fill="FFFFFF"/>
         </w:rPr>
-        <w:t>Lorem ipsum dolor sit amet</w:t>
+        <w:t xml:space="preserve">Lorem ipsum dolor </w:t>
+      </w:r>
+      <w:proofErr w:type="gramStart"/>
+      <w:r>
+        <w:rPr>
+          <w:shd w:val="clear" w:color="auto" w:fill="FFFFFF"/>
+        </w:rPr>
+        <w:t>sit</w:t>
+      </w:r>
+      <w:proofErr w:type="gramEnd"/>
+      <w:r>
+        <w:rPr>
+          <w:shd w:val="clear" w:color="auto" w:fill="FFFFFF"/>
+        </w:rPr>
+        <w:t xml:space="preserve"> amet</w:t>
       </w:r>
     </w:p>
     <w:p>
@@ -403,6 +417,20 @@
     <w:p/>
     <w:p>
       <w:pPr>
+        <w:pStyle w:val="Heading1"/>
+        <w:rPr>
+          <w:shd w:val="clear" w:color="auto" w:fill="FFFFFF"/>
+        </w:rPr>
+      </w:pPr>
+      <w:r>
+        <w:rPr>
+          <w:shd w:val="clear" w:color="auto" w:fill="FFFFFF"/>
+        </w:rPr>
+        <w:t>Merge sections</w:t>
+      </w:r>
+    </w:p>
+    <w:p>
+      <w:pPr>
         <w:pStyle w:val="Heading2"/>
         <w:rPr>
           <w:shd w:val="clear" w:color="auto" w:fill="FFFFFF"/>
@@ -420,6 +448,48 @@
         <w:t>Donec in faucibus augue, vitae pellentesque elit. Sed quis ipsum consequat, placerat mi non, ultrices nisl. Vivamus vitae ultrices tortor, quis scelerisque arcu. Vestibulum vestibulum lacus in lacus rhoncus auctor.</w:t>
       </w:r>
     </w:p>
+    <w:p>
+      <w:r>
+        <w:lastRenderedPageBreak/>
+        <w:t>A bulleted list:</w:t>
+      </w:r>
+    </w:p>
+    <w:p>
+      <w:pPr>
+        <w:pStyle w:val="ListParagraph"/>
+        <w:numPr>
+          <w:ilvl w:val="0"/>
+          <w:numId w:val="4"/>
+        </w:numPr>
+      </w:pPr>
+      <w:r>
+        <w:t>A list item</w:t>
+      </w:r>
+    </w:p>
+    <w:p>
+      <w:pPr>
+        <w:pStyle w:val="ListParagraph"/>
+        <w:numPr>
+          <w:ilvl w:val="0"/>
+          <w:numId w:val="4"/>
+        </w:numPr>
+      </w:pPr>
+      <w:r>
+        <w:t>Another list item</w:t>
+      </w:r>
+    </w:p>
+    <w:p>
+      <w:pPr>
+        <w:pStyle w:val="ListParagraph"/>
+        <w:numPr>
+          <w:ilvl w:val="0"/>
+          <w:numId w:val="4"/>
+        </w:numPr>
+      </w:pPr>
+      <w:r>
+        <w:t>A rather longer list item that I hope will wrap onto more than one list – that’s an important thing to test too.</w:t>
+      </w:r>
+    </w:p>
     <w:p/>
     <w:p>
       <w:pPr>
@@ -432,7 +502,6 @@
         <w:rPr>
           <w:shd w:val="clear" w:color="auto" w:fill="FFFFFF"/>
         </w:rPr>
-        <w:lastRenderedPageBreak/>
         <w:t>Sed rutrum consequat sapien</w:t>
       </w:r>
     </w:p>
@@ -504,7 +573,11 @@
         <w:t>Donec in faucibus augue, vitae pellentesque elit. Sed quis ipsum consequat, placerat mi non, ultrices nisl. Vivamus vitae ultrices tortor, quis scelerisque arcu. Vestibulum vestibulum lacus in lacus rhoncus auctor.</w:t>
       </w:r>
     </w:p>
-    <w:p/>
+    <w:p>
+      <w:pPr>
+        <w:pStyle w:val="heading-1-dark"/>
+      </w:pPr>
+    </w:p>
     <w:p>
       <w:r>
         <w:t>Some stuff.</w:t>
@@ -736,6 +809,7 @@
         </w:tc>
       </w:tr>
     </w:tbl>
+    <w:p/>
     <w:p/>
     <w:sectPr>
       <w:pgSz w:w="11906" w:h="16838"/>
@@ -839,6 +913,118 @@
     </w:lvl>
   </w:abstractNum>
   <w:abstractNum w:abstractNumId="1" w15:restartNumberingAfterBreak="0">
+    <w:nsid w:val="196E52A8"/>
+    <w:multiLevelType w:val="hybridMultilevel"/>
+    <w:tmpl w:val="7F8C83EE"/>
+    <w:lvl w:ilvl="0" w:tplc="165884BE">
+      <w:numFmt w:val="bullet"/>
+      <w:lvlText w:val="-"/>
+      <w:lvlJc w:val="left"/>
+      <w:pPr>
+        <w:ind w:left="720" w:hanging="360"/>
+      </w:pPr>
+      <w:rPr>
+        <w:rFonts w:ascii="Aptos" w:eastAsiaTheme="minorHAnsi" w:hAnsi="Aptos" w:cstheme="minorBidi" w:hint="default"/>
+      </w:rPr>
+    </w:lvl>
+    <w:lvl w:ilvl="1" w:tplc="08090003" w:tentative="1">
+      <w:start w:val="1"/>
+      <w:numFmt w:val="bullet"/>
+      <w:lvlText w:val="o"/>
+      <w:lvlJc w:val="left"/>
+      <w:pPr>
+        <w:ind w:left="1440" w:hanging="360"/>
+      </w:pPr>
+      <w:rPr>
+        <w:rFonts w:ascii="Courier New" w:hAnsi="Courier New" w:cs="Courier New" w:hint="default"/>
+      </w:rPr>
+    </w:lvl>
+    <w:lvl w:ilvl="2" w:tplc="08090005" w:tentative="1">
+      <w:start w:val="1"/>
+      <w:numFmt w:val="bullet"/>
+      <w:lvlText w:val=""/>
+      <w:lvlJc w:val="left"/>
+      <w:pPr>
+        <w:ind w:left="2160" w:hanging="360"/>
+      </w:pPr>
+      <w:rPr>
+        <w:rFonts w:ascii="Wingdings" w:hAnsi="Wingdings" w:hint="default"/>
+      </w:rPr>
+    </w:lvl>
+    <w:lvl w:ilvl="3" w:tplc="08090001" w:tentative="1">
+      <w:start w:val="1"/>
+      <w:numFmt w:val="bullet"/>
+      <w:lvlText w:val=""/>
+      <w:lvlJc w:val="left"/>
+      <w:pPr>
+        <w:ind w:left="2880" w:hanging="360"/>
+      </w:pPr>
+      <w:rPr>
+        <w:rFonts w:ascii="Symbol" w:hAnsi="Symbol" w:hint="default"/>
+      </w:rPr>
+    </w:lvl>
+    <w:lvl w:ilvl="4" w:tplc="08090003" w:tentative="1">
+      <w:start w:val="1"/>
+      <w:numFmt w:val="bullet"/>
+      <w:lvlText w:val="o"/>
+      <w:lvlJc w:val="left"/>
+      <w:pPr>
+        <w:ind w:left="3600" w:hanging="360"/>
+      </w:pPr>
+      <w:rPr>
+        <w:rFonts w:ascii="Courier New" w:hAnsi="Courier New" w:cs="Courier New" w:hint="default"/>
+      </w:rPr>
+    </w:lvl>
+    <w:lvl w:ilvl="5" w:tplc="08090005" w:tentative="1">
+      <w:start w:val="1"/>
+      <w:numFmt w:val="bullet"/>
+      <w:lvlText w:val=""/>
+      <w:lvlJc w:val="left"/>
+      <w:pPr>
+        <w:ind w:left="4320" w:hanging="360"/>
+      </w:pPr>
+      <w:rPr>
+        <w:rFonts w:ascii="Wingdings" w:hAnsi="Wingdings" w:hint="default"/>
+      </w:rPr>
+    </w:lvl>
+    <w:lvl w:ilvl="6" w:tplc="08090001" w:tentative="1">
+      <w:start w:val="1"/>
+      <w:numFmt w:val="bullet"/>
+      <w:lvlText w:val=""/>
+      <w:lvlJc w:val="left"/>
+      <w:pPr>
+        <w:ind w:left="5040" w:hanging="360"/>
+      </w:pPr>
+      <w:rPr>
+        <w:rFonts w:ascii="Symbol" w:hAnsi="Symbol" w:hint="default"/>
+      </w:rPr>
+    </w:lvl>
+    <w:lvl w:ilvl="7" w:tplc="08090003" w:tentative="1">
+      <w:start w:val="1"/>
+      <w:numFmt w:val="bullet"/>
+      <w:lvlText w:val="o"/>
+      <w:lvlJc w:val="left"/>
+      <w:pPr>
+        <w:ind w:left="5760" w:hanging="360"/>
+      </w:pPr>
+      <w:rPr>
+        <w:rFonts w:ascii="Courier New" w:hAnsi="Courier New" w:cs="Courier New" w:hint="default"/>
+      </w:rPr>
+    </w:lvl>
+    <w:lvl w:ilvl="8" w:tplc="08090005" w:tentative="1">
+      <w:start w:val="1"/>
+      <w:numFmt w:val="bullet"/>
+      <w:lvlText w:val=""/>
+      <w:lvlJc w:val="left"/>
+      <w:pPr>
+        <w:ind w:left="6480" w:hanging="360"/>
+      </w:pPr>
+      <w:rPr>
+        <w:rFonts w:ascii="Wingdings" w:hAnsi="Wingdings" w:hint="default"/>
+      </w:rPr>
+    </w:lvl>
+  </w:abstractNum>
+  <w:abstractNum w:abstractNumId="2" w15:restartNumberingAfterBreak="0">
     <w:nsid w:val="23B228EF"/>
     <w:multiLevelType w:val="hybridMultilevel"/>
     <w:tmpl w:val="3FF02708"/>
@@ -925,12 +1111,130 @@
       <w:pPr>
         <w:ind w:left="6480" w:hanging="180"/>
       </w:pPr>
+    </w:lvl>
+  </w:abstractNum>
+  <w:abstractNum w:abstractNumId="3" w15:restartNumberingAfterBreak="0">
+    <w:nsid w:val="31803C50"/>
+    <w:multiLevelType w:val="hybridMultilevel"/>
+    <w:tmpl w:val="E0FCB84C"/>
+    <w:lvl w:ilvl="0" w:tplc="165884BE">
+      <w:numFmt w:val="bullet"/>
+      <w:lvlText w:val="-"/>
+      <w:lvlJc w:val="left"/>
+      <w:pPr>
+        <w:ind w:left="720" w:hanging="360"/>
+      </w:pPr>
+      <w:rPr>
+        <w:rFonts w:ascii="Aptos" w:eastAsiaTheme="minorHAnsi" w:hAnsi="Aptos" w:cstheme="minorBidi" w:hint="default"/>
+      </w:rPr>
+    </w:lvl>
+    <w:lvl w:ilvl="1" w:tplc="08090003" w:tentative="1">
+      <w:start w:val="1"/>
+      <w:numFmt w:val="bullet"/>
+      <w:lvlText w:val="o"/>
+      <w:lvlJc w:val="left"/>
+      <w:pPr>
+        <w:ind w:left="1440" w:hanging="360"/>
+      </w:pPr>
+      <w:rPr>
+        <w:rFonts w:ascii="Courier New" w:hAnsi="Courier New" w:cs="Courier New" w:hint="default"/>
+      </w:rPr>
+    </w:lvl>
+    <w:lvl w:ilvl="2" w:tplc="08090005" w:tentative="1">
+      <w:start w:val="1"/>
+      <w:numFmt w:val="bullet"/>
+      <w:lvlText w:val=""/>
+      <w:lvlJc w:val="left"/>
+      <w:pPr>
+        <w:ind w:left="2160" w:hanging="360"/>
+      </w:pPr>
+      <w:rPr>
+        <w:rFonts w:ascii="Wingdings" w:hAnsi="Wingdings" w:hint="default"/>
+      </w:rPr>
+    </w:lvl>
+    <w:lvl w:ilvl="3" w:tplc="08090001" w:tentative="1">
+      <w:start w:val="1"/>
+      <w:numFmt w:val="bullet"/>
+      <w:lvlText w:val=""/>
+      <w:lvlJc w:val="left"/>
+      <w:pPr>
+        <w:ind w:left="2880" w:hanging="360"/>
+      </w:pPr>
+      <w:rPr>
+        <w:rFonts w:ascii="Symbol" w:hAnsi="Symbol" w:hint="default"/>
+      </w:rPr>
+    </w:lvl>
+    <w:lvl w:ilvl="4" w:tplc="08090003" w:tentative="1">
+      <w:start w:val="1"/>
+      <w:numFmt w:val="bullet"/>
+      <w:lvlText w:val="o"/>
+      <w:lvlJc w:val="left"/>
+      <w:pPr>
+        <w:ind w:left="3600" w:hanging="360"/>
+      </w:pPr>
+      <w:rPr>
+        <w:rFonts w:ascii="Courier New" w:hAnsi="Courier New" w:cs="Courier New" w:hint="default"/>
+      </w:rPr>
+    </w:lvl>
+    <w:lvl w:ilvl="5" w:tplc="08090005" w:tentative="1">
+      <w:start w:val="1"/>
+      <w:numFmt w:val="bullet"/>
+      <w:lvlText w:val=""/>
+      <w:lvlJc w:val="left"/>
+      <w:pPr>
+        <w:ind w:left="4320" w:hanging="360"/>
+      </w:pPr>
+      <w:rPr>
+        <w:rFonts w:ascii="Wingdings" w:hAnsi="Wingdings" w:hint="default"/>
+      </w:rPr>
+    </w:lvl>
+    <w:lvl w:ilvl="6" w:tplc="08090001" w:tentative="1">
+      <w:start w:val="1"/>
+      <w:numFmt w:val="bullet"/>
+      <w:lvlText w:val=""/>
+      <w:lvlJc w:val="left"/>
+      <w:pPr>
+        <w:ind w:left="5040" w:hanging="360"/>
+      </w:pPr>
+      <w:rPr>
+        <w:rFonts w:ascii="Symbol" w:hAnsi="Symbol" w:hint="default"/>
+      </w:rPr>
+    </w:lvl>
+    <w:lvl w:ilvl="7" w:tplc="08090003" w:tentative="1">
+      <w:start w:val="1"/>
+      <w:numFmt w:val="bullet"/>
+      <w:lvlText w:val="o"/>
+      <w:lvlJc w:val="left"/>
+      <w:pPr>
+        <w:ind w:left="5760" w:hanging="360"/>
+      </w:pPr>
+      <w:rPr>
+        <w:rFonts w:ascii="Courier New" w:hAnsi="Courier New" w:cs="Courier New" w:hint="default"/>
+      </w:rPr>
+    </w:lvl>
+    <w:lvl w:ilvl="8" w:tplc="08090005" w:tentative="1">
+      <w:start w:val="1"/>
+      <w:numFmt w:val="bullet"/>
+      <w:lvlText w:val=""/>
+      <w:lvlJc w:val="left"/>
+      <w:pPr>
+        <w:ind w:left="6480" w:hanging="360"/>
+      </w:pPr>
+      <w:rPr>
+        <w:rFonts w:ascii="Wingdings" w:hAnsi="Wingdings" w:hint="default"/>
+      </w:rPr>
     </w:lvl>
   </w:abstractNum>
   <w:num w:numId="1" w16cid:durableId="489449222">
     <w:abstractNumId w:val="0"/>
   </w:num>
   <w:num w:numId="2" w16cid:durableId="115684629">
+    <w:abstractNumId w:val="2"/>
+  </w:num>
+  <w:num w:numId="3" w16cid:durableId="1904369707">
+    <w:abstractNumId w:val="3"/>
+  </w:num>
+  <w:num w:numId="4" w16cid:durableId="506528501">
     <w:abstractNumId w:val="1"/>
   </w:num>
 </w:numbering>
@@ -2015,6 +2319,15 @@
       <w:szCs w:val="18"/>
     </w:rPr>
   </w:style>
+  <w:style w:type="paragraph" w:customStyle="1" w:styleId="merge-level-1-section">
+    <w:name w:val="merge-level-1-section"/>
+    <w:basedOn w:val="Heading1"/>
+    <w:qFormat/>
+    <w:rsid w:val="00E81C7A"/>
+    <w:rPr>
+      <w:shd w:val="clear" w:color="auto" w:fill="FFFFFF"/>
+    </w:rPr>
+  </w:style>
 </w:styles>
 </file>
 

</xml_diff>